<commit_message>
Refactor webhook methods and update thesis documentation
Updated the `aceptar-propuesta.tsx` component to use POST requests for the webhook, ensuring the correct payload is sent. Adjusted the `lead-form.tsx` to point to the production webhook endpoint. Additionally, revised the `dictamen-tesis.md` to reflect recent resolutions regarding the webhook methods and the state of the art section, enhancing clarity and alignment with the current implementation.
</commit_message>
<xml_diff>
--- a/tesis.docx
+++ b/tesis.docx
@@ -364,6 +364,11 @@
       </w:r>
     </w:p>
     <w:p>
+      <w:r>
+        <w:t xml:space="preserve">El posicionamiento de esta decisión frente a las soluciones existentes se desarrolla en el estado del arte (§2.7) y en la discusión de construir frente a configurar (§2.8).</w:t>
+      </w:r>
+    </w:p>
+    <w:p>
       <w:pPr>
         <w:pStyle w:val="Heading2"/>
       </w:pPr>
@@ -732,6 +737,191 @@
       </w:r>
       <w:r>
         <w:t xml:space="preserve"> protegen acciones públicas que no requieren cuenta —como la aceptación de una propuesta— asegurando que solo quien recibe el enlace pueda ejecutarla y que este no pueda reutilizarse. Este enfoque de defensa en profundidad es coherente con las buenas prácticas de seguridad en aplicaciones web (OWASP, 2021).</w:t>
+      </w:r>
+    </w:p>
+    <w:p>
+      <w:pPr>
+        <w:pStyle w:val="Heading2"/>
+      </w:pPr>
+      <w:r>
+        <w:t xml:space="preserve">2.7 Antecedentes y estado del arte</w:t>
+      </w:r>
+    </w:p>
+    <w:p>
+      <w:r>
+        <w:t xml:space="preserve">Antes de justificar la decisión de construir una solución propia, corresponde situarla frente a las herramientas que ya atienden, parcial o totalmente, el mismo problema: la automatización de la relación comercial con clientes. La literatura reconoce que automatizar el marketing y las ventas es una práctica ya establecida en el ámbito B2B (Järvinen y Taiminen, 2016), lo que motiva revisar dos categorías de soluciones comerciales: los CRM con funciones de automatización y las plataformas de integración de bajo código (iPaaS).</w:t>
+      </w:r>
+    </w:p>
+    <w:p>
+      <w:pPr>
+        <w:pStyle w:val="ListParagraph"/>
+        <w:numPr>
+          <w:ilvl w:val="0"/>
+          <w:numId w:val="1"/>
+        </w:numPr>
+      </w:pPr>
+      <w:r>
+        <w:rPr>
+          <w:b/>
+        </w:rPr>
+        <w:t xml:space="preserve">HubSpot: </w:t>
+      </w:r>
+      <w:r>
+        <w:t xml:space="preserve">CRM todo en uno que combina pipeline de ventas, marketing por correo y una capa de automatización con scoring de leads configurable. Su plan gratuito cubre el registro básico de contactos, pero el scoring predictivo, los flujos de automatización avanzados y las integraciones profundas se habilitan en niveles de suscripción pagos por asiento. Los datos quedan alojados en la infraestructura del proveedor y la generación de documentos como facturas o propuestas requiere integraciones de terceros.</w:t>
+      </w:r>
+    </w:p>
+    <w:p>
+      <w:pPr>
+        <w:pStyle w:val="ListParagraph"/>
+        <w:numPr>
+          <w:ilvl w:val="0"/>
+          <w:numId w:val="1"/>
+        </w:numPr>
+      </w:pPr>
+      <w:r>
+        <w:rPr>
+          <w:b/>
+        </w:rPr>
+        <w:t xml:space="preserve">Pipedrive: </w:t>
+      </w:r>
+      <w:r>
+        <w:t xml:space="preserve">CRM centrado en la gestión visual del pipeline de ventas, con formularios web de captación y reportes de embudo. Al igual que HubSpot, su modelo comercial cobra por asiento y por mes; carece de un motor de scoring configurable a nivel de reglas propias y no incluye generación nativa de facturación, por lo que requiere integraciones externas para cerrar el ciclo comercial completo.</w:t>
+      </w:r>
+    </w:p>
+    <w:p>
+      <w:pPr>
+        <w:pStyle w:val="ListParagraph"/>
+        <w:numPr>
+          <w:ilvl w:val="0"/>
+          <w:numId w:val="1"/>
+        </w:numPr>
+      </w:pPr>
+      <w:r>
+        <w:rPr>
+          <w:b/>
+        </w:rPr>
+        <w:t xml:space="preserve">Zapier: </w:t>
+      </w:r>
+      <w:r>
+        <w:t xml:space="preserve">plataforma de integración (iPaaS) que conecta aplicaciones SaaS mediante disparadores y acciones sin código. No constituye un sistema de registro propio: opera sobre los datos que ya residen en otras plataformas y cobra en función de la cantidad de tareas ejecutadas por mes, un modelo cuyo costo escala con el volumen de leads procesados.</w:t>
+      </w:r>
+    </w:p>
+    <w:p>
+      <w:pPr>
+        <w:pStyle w:val="ListParagraph"/>
+        <w:numPr>
+          <w:ilvl w:val="0"/>
+          <w:numId w:val="1"/>
+        </w:numPr>
+      </w:pPr>
+      <w:r>
+        <w:rPr>
+          <w:b/>
+        </w:rPr>
+        <w:t xml:space="preserve">Make (anteriormente Integromat): </w:t>
+      </w:r>
+      <w:r>
+        <w:t xml:space="preserve">junto con n8n, una de las plataformas de automatización visual por escenarios más cercanas en filosofía al presente trabajo. A diferencia de n8n, Make se ofrece exclusivamente como servicio en la nube, con planes tarifados por operaciones ejecutadas; los datos del proceso transitan por la infraestructura del proveedor y no existe una alternativa de auto-alojamiento equivalente a la que permite este trabajo.</w:t>
+      </w:r>
+    </w:p>
+    <w:p>
+      <w:r>
+        <w:t xml:space="preserve">Ninguna de estas soluciones cubre, en un único producto, el problema tal como se lo plantea en este trabajo. HubSpot y Pipedrive ofrecen un CRM robusto pero con reglas de calificación y facturación limitadas o dependientes de terceros; Zapier y Make automatizan la integración entre sistemas pero no son, en sí mismos, un sistema de registro con reglas de negocio propias. En ambos casos, el costo recurrente por asiento, por tarea o por operación, y la dependencia de la infraestructura del proveedor, son barreras relevantes para un freelancer individual. El vacío que este trabajo cubre es, entonces, un pipeline auto-alojable, de bajo costo operativo y con propiedad total del dato, que encadena captación, normalización y scoring con reglas propias (Tabla 4), generación y envío de propuesta, aceptación mediante token de un solo uso, facturación en PDF (Gotenberg), registro de pago y cierre, sin las cuotas recurrentes por asiento o por tarea que caracterizan a las soluciones comerciales revisadas.</w:t>
+      </w:r>
+    </w:p>
+    <w:p>
+      <w:pPr>
+        <w:pStyle w:val="Heading2"/>
+      </w:pPr>
+      <w:r>
+        <w:t xml:space="preserve">2.8 Construir frente a configurar una herramienta existente</w:t>
+      </w:r>
+    </w:p>
+    <w:p>
+      <w:r>
+        <w:t xml:space="preserve">Dado que existen CRMs y plataformas de integración capaces de cubrir partes del problema, cabe preguntarse por qué se optó por construir una solución propia en lugar de configurar alguna de ellas. La respuesta se apoya en cuatro razones.</w:t>
+      </w:r>
+    </w:p>
+    <w:p>
+      <w:pPr>
+        <w:pStyle w:val="ListParagraph"/>
+        <w:numPr>
+          <w:ilvl w:val="0"/>
+          <w:numId w:val="1"/>
+        </w:numPr>
+      </w:pPr>
+      <w:r>
+        <w:rPr>
+          <w:b/>
+        </w:rPr>
+        <w:t xml:space="preserve">Costo y dependencia del proveedor: </w:t>
+      </w:r>
+      <w:r>
+        <w:t xml:space="preserve">los planes de HubSpot, Pipedrive, Zapier y Make cobran cuotas recurrentes por asiento, por tarea o por operación que crecen con el uso. El stack elegido (n8n y Supabase) es auto-alojable y evita ese costo marginal creciente, lo que resulta relevante para un freelancer individual con presupuesto acotado.</w:t>
+      </w:r>
+    </w:p>
+    <w:p>
+      <w:pPr>
+        <w:pStyle w:val="ListParagraph"/>
+        <w:numPr>
+          <w:ilvl w:val="0"/>
+          <w:numId w:val="1"/>
+        </w:numPr>
+      </w:pPr>
+      <w:r>
+        <w:rPr>
+          <w:b/>
+        </w:rPr>
+        <w:t xml:space="preserve">Propiedad del dato y seguridad: </w:t>
+      </w:r>
+      <w:r>
+        <w:t xml:space="preserve">correr la base de datos y la orquestación sobre infraestructura propia permite aplicar políticas de seguridad a nivel de fila y tokens de un solo uso bajo control directo del equipo (véase §4.6 y Anexo C), en línea con las recomendaciones de OWASP (2021), en lugar de delegar la custodia del dato comercial a un tercero.</w:t>
+      </w:r>
+    </w:p>
+    <w:p>
+      <w:pPr>
+        <w:pStyle w:val="ListParagraph"/>
+        <w:numPr>
+          <w:ilvl w:val="0"/>
+          <w:numId w:val="1"/>
+        </w:numPr>
+      </w:pPr>
+      <w:r>
+        <w:rPr>
+          <w:b/>
+        </w:rPr>
+        <w:t xml:space="preserve">Personalización de las reglas de negocio: </w:t>
+      </w:r>
+      <w:r>
+        <w:t xml:space="preserve">las reglas de scoring (Tabla 4) y el encadenamiento completo captación–propuesta–aceptación–factura–cobro–cierre son específicas del flujo comercial de un freelancer y no están disponibles llave en mano en los productos revisados, que ofrecen scoring genérico o requieren integraciones adicionales para completar el ciclo.</w:t>
+      </w:r>
+    </w:p>
+    <w:p>
+      <w:pPr>
+        <w:pStyle w:val="ListParagraph"/>
+        <w:numPr>
+          <w:ilvl w:val="0"/>
+          <w:numId w:val="1"/>
+        </w:numPr>
+      </w:pPr>
+      <w:r>
+        <w:rPr>
+          <w:b/>
+        </w:rPr>
+        <w:t xml:space="preserve">Objetivo formativo del trabajo: </w:t>
+      </w:r>
+      <w:r>
+        <w:t xml:space="preserve">el propósito declarado (§1.4, §1.5) es evidenciar competencias de integración de un Técnico Universitario en Programación mediante un artefacto de software verificable; operar una herramienta comercial ya configurada no habría permitido demostrar esas competencias de diseño e implementación.</w:t>
+      </w:r>
+    </w:p>
+    <w:p>
+      <w:r>
+        <w:t xml:space="preserve">Esta decisión no está exenta de costos: construir implica asumir el esfuerzo de desarrollo y el mantenimiento posterior del artefacto, responsabilidades que un producto comercial ya resuelto no exige. Configurar una herramienta existente sería preferible en un contexto distinto —un equipo con varios usuarios no técnicos, o una organización que priorice soporte comercial maduro por sobre la personalización—, escenario que excede el alcance de este trabajo (§1.7).</w:t>
+      </w:r>
+    </w:p>
+    <w:p>
+      <w:r>
+        <w:t xml:space="preserve">Para el alcance definido —un freelancer individual, con propiedad total del dato, un ciclo de vida comercial a medida y un objetivo formativo explícito—, construir la solución está justificado. El aporte original del trabajo no reside en un algoritmo aislado, sino en el pipeline integrado, propio, de bajo costo y extremo a extremo que encadena las etapas descritas, verificado componente a componente contra el código fuente (§4.1).</w:t>
       </w:r>
     </w:p>
     <w:p>
@@ -2915,7 +3105,7 @@
         <w:t xml:space="preserve">/aceptar/[leadId]</w:t>
       </w:r>
       <w:r>
-        <w:t xml:space="preserve"> recibe, además del identificador del lead, un token en el parámetro de consulta. El componente consulta al webhook de aceptación de n8n y, según la respuesta, informa al cliente uno de tres desenlaces: aceptación satisfactoria, enlace ya utilizado o enlace inválido o vencido. Al no requerir cuenta, esta ruta se protege exclusivamente con el token, no con Supabase Auth.</w:t>
+        <w:t xml:space="preserve"> recibe, además del identificador del lead, un token en el parámetro de consulta (así llega por tratarse de un enlace enviado por correo). El componente envía ambos datos —identificador y token— en el cuerpo de una petición POST al webhook de aceptación de n8n y, según la respuesta, informa al cliente uno de tres desenlaces: aceptación satisfactoria, enlace ya utilizado o enlace inválido o vencido. Al no requerir cuenta, esta ruta se protege exclusivamente con el token, no con Supabase Auth.</w:t>
       </w:r>
     </w:p>
     <w:p>
@@ -3775,7 +3965,7 @@
     </w:p>
     <w:p>
       <w:r>
-        <w:t xml:space="preserve">El modelo relacional se compone de tres tablas y dos vistas. La Tabla 5 describe la tabla </w:t>
+        <w:t xml:space="preserve">El modelo relacional se compone de cinco tablas y dos vistas: cuatro tablas de negocio —</w:t>
       </w:r>
       <w:r>
         <w:rPr>
@@ -3784,6 +3974,51 @@
         <w:t xml:space="preserve">leads</w:t>
       </w:r>
       <w:r>
+        <w:t xml:space="preserve">, </w:t>
+      </w:r>
+      <w:r>
+        <w:rPr>
+          <w:rFonts w:ascii="Consolas" w:hAnsi="Consolas" w:cs="Consolas"/>
+        </w:rPr>
+        <w:t xml:space="preserve">facturas</w:t>
+      </w:r>
+      <w:r>
+        <w:t xml:space="preserve">, </w:t>
+      </w:r>
+      <w:r>
+        <w:rPr>
+          <w:rFonts w:ascii="Consolas" w:hAnsi="Consolas" w:cs="Consolas"/>
+        </w:rPr>
+        <w:t xml:space="preserve">seguimientos</w:t>
+      </w:r>
+      <w:r>
+        <w:t xml:space="preserve"> y </w:t>
+      </w:r>
+      <w:r>
+        <w:rPr>
+          <w:rFonts w:ascii="Consolas" w:hAnsi="Consolas" w:cs="Consolas"/>
+        </w:rPr>
+        <w:t xml:space="preserve">logs</w:t>
+      </w:r>
+      <w:r>
+        <w:t xml:space="preserve">— y la tabla </w:t>
+      </w:r>
+      <w:r>
+        <w:rPr>
+          <w:rFonts w:ascii="Consolas" w:hAnsi="Consolas" w:cs="Consolas"/>
+        </w:rPr>
+        <w:t xml:space="preserve">profiles</w:t>
+      </w:r>
+      <w:r>
+        <w:t xml:space="preserve">, que asigna a cada usuario un rol de aplicación (§4.6). La Tabla 5 describe la tabla </w:t>
+      </w:r>
+      <w:r>
+        <w:rPr>
+          <w:rFonts w:ascii="Consolas" w:hAnsi="Consolas" w:cs="Consolas"/>
+        </w:rPr>
+        <w:t xml:space="preserve">leads</w:t>
+      </w:r>
+      <w:r>
         <w:t xml:space="preserve">, núcleo del sistema, y la Tabla 6 resume las tablas </w:t>
       </w:r>
       <w:r>
@@ -3793,13 +4028,22 @@
         <w:t xml:space="preserve">facturas</w:t>
       </w:r>
       <w:r>
+        <w:t xml:space="preserve">, </w:t>
+      </w:r>
+      <w:r>
+        <w:rPr>
+          <w:rFonts w:ascii="Consolas" w:hAnsi="Consolas" w:cs="Consolas"/>
+        </w:rPr>
+        <w:t xml:space="preserve">seguimientos</w:t>
+      </w:r>
+      <w:r>
         <w:t xml:space="preserve"> y </w:t>
       </w:r>
       <w:r>
         <w:rPr>
           <w:rFonts w:ascii="Consolas" w:hAnsi="Consolas" w:cs="Consolas"/>
         </w:rPr>
-        <w:t xml:space="preserve">seguimientos</w:t>
+        <w:t xml:space="preserve">logs</w:t>
       </w:r>
       <w:r>
         <w:t xml:space="preserve">.</w:t>
@@ -4190,7 +4434,7 @@
           <w:sz w:val="20"/>
           <w:szCs w:val="20"/>
         </w:rPr>
-        <w:t xml:space="preserve">Tabla 6. Esquema de las tablas facturas y seguimientos</w:t>
+        <w:t xml:space="preserve">Tabla 6. Esquema de las tablas facturas, seguimientos y logs</w:t>
       </w:r>
     </w:p>
     <w:tbl>
@@ -4278,7 +4522,7 @@
               <w:jc w:val="left"/>
             </w:pPr>
             <w:r>
-              <w:t xml:space="preserve">factura_id, lead_id, cliente, email, servicio, monto, estado_pago (PENDIENTE/COBRADO), fecha_cobro.</w:t>
+              <w:t xml:space="preserve">factura_id, lead_id, cliente, email, servicio, monto, estado_pago (PENDIENTE/COBRADO/VENCIDA/ANULADA), fecha_cobro.</w:t>
             </w:r>
           </w:p>
         </w:tc>
@@ -4309,6 +4553,36 @@
             </w:pPr>
             <w:r>
               <w:t xml:space="preserve">lead_id, numero, canal, asunto.</w:t>
+            </w:r>
+          </w:p>
+        </w:tc>
+      </w:tr>
+      <w:tr>
+        <w:tc>
+          <w:tcPr>
+            <w:tcW w:w="1800" w:type="dxa"/>
+          </w:tcPr>
+          <w:p>
+            <w:pPr>
+              <w:spacing w:after="20" w:line="240" w:lineRule="auto"/>
+              <w:jc w:val="left"/>
+            </w:pPr>
+            <w:r>
+              <w:t xml:space="preserve">logs</w:t>
+            </w:r>
+          </w:p>
+        </w:tc>
+        <w:tc>
+          <w:tcPr>
+            <w:tcW w:w="7200" w:type="dxa"/>
+          </w:tcPr>
+          <w:p>
+            <w:pPr>
+              <w:spacing w:after="20" w:line="240" w:lineRule="auto"/>
+              <w:jc w:val="left"/>
+            </w:pPr>
+            <w:r>
+              <w:t xml:space="preserve">workflow, lead_id, evento, nivel, detalle, error_msg — auditoría y registro de errores de los flujos de n8n.</w:t>
             </w:r>
           </w:p>
         </w:tc>
@@ -4336,6 +4610,65 @@
       </w:r>
       <w:r>
         <w:t xml:space="preserve"> computan, respectivamente, los indicadores mensuales que alimentan el tablero y el listado de facturas con sus días al vencimiento. La Tabla 7 enumera los estados por los que transita un lead.</w:t>
+      </w:r>
+    </w:p>
+    <w:p>
+      <w:r>
+        <w:t xml:space="preserve">La columna </w:t>
+      </w:r>
+      <w:r>
+        <w:rPr>
+          <w:rFonts w:ascii="Consolas" w:hAnsi="Consolas" w:cs="Consolas"/>
+        </w:rPr>
+        <w:t xml:space="preserve">estado_pago</w:t>
+      </w:r>
+      <w:r>
+        <w:t xml:space="preserve"> de </w:t>
+      </w:r>
+      <w:r>
+        <w:rPr>
+          <w:rFonts w:ascii="Consolas" w:hAnsi="Consolas" w:cs="Consolas"/>
+        </w:rPr>
+        <w:t xml:space="preserve">facturas</w:t>
+      </w:r>
+      <w:r>
+        <w:t xml:space="preserve"> transita por cuatro estados: </w:t>
+      </w:r>
+      <w:r>
+        <w:rPr>
+          <w:rFonts w:ascii="Consolas" w:hAnsi="Consolas" w:cs="Consolas"/>
+        </w:rPr>
+        <w:t xml:space="preserve">PENDIENTE</w:t>
+      </w:r>
+      <w:r>
+        <w:t xml:space="preserve"> (factura emitida, aún sin cobrar), </w:t>
+      </w:r>
+      <w:r>
+        <w:rPr>
+          <w:rFonts w:ascii="Consolas" w:hAnsi="Consolas" w:cs="Consolas"/>
+        </w:rPr>
+        <w:t xml:space="preserve">COBRADO</w:t>
+      </w:r>
+      <w:r>
+        <w:t xml:space="preserve"> (pago registrado), </w:t>
+      </w:r>
+      <w:r>
+        <w:rPr>
+          <w:rFonts w:ascii="Consolas" w:hAnsi="Consolas" w:cs="Consolas"/>
+        </w:rPr>
+        <w:t xml:space="preserve">VENCIDA</w:t>
+      </w:r>
+      <w:r>
+        <w:t xml:space="preserve"> (se superó la fecha de vencimiento sin cobro) y </w:t>
+      </w:r>
+      <w:r>
+        <w:rPr>
+          <w:rFonts w:ascii="Consolas" w:hAnsi="Consolas" w:cs="Consolas"/>
+        </w:rPr>
+        <w:t xml:space="preserve">ANULADA</w:t>
+      </w:r>
+      <w:r>
+        <w:t xml:space="preserve"> (factura anulada o cancelada).</w:t>
       </w:r>
     </w:p>
     <w:p>
@@ -4917,7 +5250,7 @@
     </w:p>
     <w:p>
       <w:r>
-        <w:t xml:space="preserve">El acceso al tablero requiere autenticación con Supabase Auth. Sobre las tablas de negocio se habilita la seguridad a nivel de fila con políticas que otorgan lectura únicamente al rol autenticado, mientras que las vistas se declaran con la opción </w:t>
+        <w:t xml:space="preserve">El acceso al tablero requiere autenticación con Supabase Auth. Sobre las tablas de negocio se habilita la seguridad a nivel de fila con políticas que otorgan lectura únicamente a los usuarios autenticados con rol admin (registrado en la tabla profiles), mientras que las vistas se declaran con la opción </w:t>
       </w:r>
       <w:r>
         <w:rPr>
@@ -5006,7 +5339,34 @@
         <w:t xml:space="preserve">PENDIENTE</w:t>
       </w:r>
       <w:r>
-        <w:t xml:space="preserve">.</w:t>
+        <w:t xml:space="preserve">; una factura </w:t>
+      </w:r>
+      <w:r>
+        <w:rPr>
+          <w:rFonts w:ascii="Consolas" w:hAnsi="Consolas" w:cs="Consolas"/>
+        </w:rPr>
+        <w:t xml:space="preserve">PENDIENTE</w:t>
+      </w:r>
+      <w:r>
+        <w:t xml:space="preserve"> pasa a </w:t>
+      </w:r>
+      <w:r>
+        <w:rPr>
+          <w:rFonts w:ascii="Consolas" w:hAnsi="Consolas" w:cs="Consolas"/>
+        </w:rPr>
+        <w:t xml:space="preserve">VENCIDA</w:t>
+      </w:r>
+      <w:r>
+        <w:t xml:space="preserve"> cuando supera su fecha de vencimiento sin cobro, y a </w:t>
+      </w:r>
+      <w:r>
+        <w:rPr>
+          <w:rFonts w:ascii="Consolas" w:hAnsi="Consolas" w:cs="Consolas"/>
+        </w:rPr>
+        <w:t xml:space="preserve">ANULADA</w:t>
+      </w:r>
+      <w:r>
+        <w:t xml:space="preserve"> si se cancela.</w:t>
       </w:r>
     </w:p>
     <w:p>
@@ -5024,7 +5384,7 @@
     </w:p>
     <w:p>
       <w:r>
-        <w:t xml:space="preserve">Los resultados que se presentan corresponden a la ejecución de escenarios de prueba controlados, concebidos para verificar el comportamiento del sistema, y no a métricas de operación en producción, que exceden el alcance del trabajo (véase el Capítulo 6). Cada escenario se describe con su entrada, el procesamiento esperado y el resultado observado.</w:t>
+        <w:t xml:space="preserve">Los resultados que se presentan corresponden a la ejecución de escenarios de prueba controlados, concebidos para verificar el comportamiento del sistema, y no a métricas de operación en producción, que exceden el alcance del trabajo (véase el Capítulo 6). Cada escenario se describe con su entrada, el resultado esperado según las reglas de diseño, el resultado observado en la ejecución y la evidencia asociada (a incorporar).</w:t>
       </w:r>
     </w:p>
     <w:p>
@@ -5054,9 +5414,11 @@
         <w:tblLook w:val="04A0" w:firstRow="1" w:lastRow="0" w:firstColumn="1" w:lastColumn="0" w:noHBand="0" w:noVBand="1"/>
       </w:tblPr>
       <w:tblGrid>
-        <w:gridCol w:w="600"/>
-        <w:gridCol w:w="4200"/>
-        <w:gridCol w:w="4200"/>
+        <w:gridCol w:w="500"/>
+        <w:gridCol w:w="2500"/>
+        <w:gridCol w:w="2200"/>
+        <w:gridCol w:w="2200"/>
+        <w:gridCol w:w="1600"/>
       </w:tblGrid>
       <w:tr>
         <w:trPr>
@@ -5064,7 +5426,7 @@
         </w:trPr>
         <w:tc>
           <w:tcPr>
-            <w:tcW w:w="600" w:type="dxa"/>
+            <w:tcW w:w="500" w:type="dxa"/>
             <w:shd w:val="clear" w:color="auto" w:fill="1F2937"/>
           </w:tcPr>
           <w:p>
@@ -5083,7 +5445,7 @@
         </w:tc>
         <w:tc>
           <w:tcPr>
-            <w:tcW w:w="4200" w:type="dxa"/>
+            <w:tcW w:w="2500" w:type="dxa"/>
             <w:shd w:val="clear" w:color="auto" w:fill="1F2937"/>
           </w:tcPr>
           <w:p>
@@ -5102,7 +5464,7 @@
         </w:tc>
         <w:tc>
           <w:tcPr>
-            <w:tcW w:w="4200" w:type="dxa"/>
+            <w:tcW w:w="2200" w:type="dxa"/>
             <w:shd w:val="clear" w:color="auto" w:fill="1F2937"/>
           </w:tcPr>
           <w:p>
@@ -5115,15 +5477,53 @@
                 <w:b/>
                 <w:color w:val="FFFFFF"/>
               </w:rPr>
-              <w:t xml:space="preserve">Resultado esperado y observado</w:t>
-            </w:r>
-          </w:p>
-        </w:tc>
-      </w:tr>
-      <w:tr>
-        <w:tc>
-          <w:tcPr>
-            <w:tcW w:w="600" w:type="dxa"/>
+              <w:t xml:space="preserve">Resultado esperado</w:t>
+            </w:r>
+          </w:p>
+        </w:tc>
+        <w:tc>
+          <w:tcPr>
+            <w:tcW w:w="2200" w:type="dxa"/>
+            <w:shd w:val="clear" w:color="auto" w:fill="1F2937"/>
+          </w:tcPr>
+          <w:p>
+            <w:pPr>
+              <w:spacing w:after="20" w:line="240" w:lineRule="auto"/>
+              <w:jc w:val="left"/>
+            </w:pPr>
+            <w:r>
+              <w:rPr>
+                <w:b/>
+                <w:color w:val="FFFFFF"/>
+              </w:rPr>
+              <w:t xml:space="preserve">Resultado observado</w:t>
+            </w:r>
+          </w:p>
+        </w:tc>
+        <w:tc>
+          <w:tcPr>
+            <w:tcW w:w="1600" w:type="dxa"/>
+            <w:shd w:val="clear" w:color="auto" w:fill="1F2937"/>
+          </w:tcPr>
+          <w:p>
+            <w:pPr>
+              <w:spacing w:after="20" w:line="240" w:lineRule="auto"/>
+              <w:jc w:val="left"/>
+            </w:pPr>
+            <w:r>
+              <w:rPr>
+                <w:b/>
+                <w:color w:val="FFFFFF"/>
+              </w:rPr>
+              <w:t xml:space="preserve">Evidencia</w:t>
+            </w:r>
+          </w:p>
+        </w:tc>
+      </w:tr>
+      <w:tr>
+        <w:tc>
+          <w:tcPr>
+            <w:tcW w:w="500" w:type="dxa"/>
           </w:tcPr>
           <w:p>
             <w:pPr>
@@ -5137,7 +5537,7 @@
         </w:tc>
         <w:tc>
           <w:tcPr>
-            <w:tcW w:w="4200" w:type="dxa"/>
+            <w:tcW w:w="2500" w:type="dxa"/>
           </w:tcPr>
           <w:p>
             <w:pPr>
@@ -5151,23 +5551,51 @@
         </w:tc>
         <w:tc>
           <w:tcPr>
-            <w:tcW w:w="4200" w:type="dxa"/>
-          </w:tcPr>
-          <w:p>
-            <w:pPr>
-              <w:spacing w:after="20" w:line="240" w:lineRule="auto"/>
-              <w:jc w:val="left"/>
-            </w:pPr>
-            <w:r>
-              <w:t xml:space="preserve">Normalización correcta; score elevado; clasificación HOT; generación y envío de propuesta; estado PROPUESTA_ENVIADA.</w:t>
-            </w:r>
-          </w:p>
-        </w:tc>
-      </w:tr>
-      <w:tr>
-        <w:tc>
-          <w:tcPr>
-            <w:tcW w:w="600" w:type="dxa"/>
+            <w:tcW w:w="2200" w:type="dxa"/>
+          </w:tcPr>
+          <w:p>
+            <w:pPr>
+              <w:spacing w:after="20" w:line="240" w:lineRule="auto"/>
+              <w:jc w:val="left"/>
+            </w:pPr>
+            <w:r>
+              <w:t xml:space="preserve">Presupuesto y urgencia altos deben normalizarse correctamente, obtener un score elevado y clasificarse como HOT, con generación y envío automático de la propuesta (estado PROPUESTA_ENVIADA), según las reglas de scoring (Tabla 4).</w:t>
+            </w:r>
+          </w:p>
+        </w:tc>
+        <w:tc>
+          <w:tcPr>
+            <w:tcW w:w="2200" w:type="dxa"/>
+          </w:tcPr>
+          <w:p>
+            <w:pPr>
+              <w:spacing w:after="20" w:line="240" w:lineRule="auto"/>
+              <w:jc w:val="left"/>
+            </w:pPr>
+            <w:r>
+              <w:t xml:space="preserve">Normalización correcta; score elevado; clasificación HOT; propuesta generada y enviada; estado PROPUESTA_ENVIADA.</w:t>
+            </w:r>
+          </w:p>
+        </w:tc>
+        <w:tc>
+          <w:tcPr>
+            <w:tcW w:w="1600" w:type="dxa"/>
+          </w:tcPr>
+          <w:p>
+            <w:pPr>
+              <w:spacing w:after="20" w:line="240" w:lineRule="auto"/>
+              <w:jc w:val="left"/>
+            </w:pPr>
+            <w:r>
+              <w:t xml:space="preserve">Pendiente — adjuntar captura del tablero y/o registro de ejecución de n8n para E1.</w:t>
+            </w:r>
+          </w:p>
+        </w:tc>
+      </w:tr>
+      <w:tr>
+        <w:tc>
+          <w:tcPr>
+            <w:tcW w:w="500" w:type="dxa"/>
           </w:tcPr>
           <w:p>
             <w:pPr>
@@ -5181,7 +5609,7 @@
         </w:tc>
         <w:tc>
           <w:tcPr>
-            <w:tcW w:w="4200" w:type="dxa"/>
+            <w:tcW w:w="2500" w:type="dxa"/>
           </w:tcPr>
           <w:p>
             <w:pPr>
@@ -5195,7 +5623,21 @@
         </w:tc>
         <w:tc>
           <w:tcPr>
-            <w:tcW w:w="4200" w:type="dxa"/>
+            <w:tcW w:w="2200" w:type="dxa"/>
+          </w:tcPr>
+          <w:p>
+            <w:pPr>
+              <w:spacing w:after="20" w:line="240" w:lineRule="auto"/>
+              <w:jc w:val="left"/>
+            </w:pPr>
+            <w:r>
+              <w:t xml:space="preserve">Presupuesto y urgencia medios deben clasificar el lead como WARM, enviar la propuesta y persistir el registro en la tabla leads.</w:t>
+            </w:r>
+          </w:p>
+        </w:tc>
+        <w:tc>
+          <w:tcPr>
+            <w:tcW w:w="2200" w:type="dxa"/>
           </w:tcPr>
           <w:p>
             <w:pPr>
@@ -5207,11 +5649,25 @@
             </w:r>
           </w:p>
         </w:tc>
-      </w:tr>
-      <w:tr>
-        <w:tc>
-          <w:tcPr>
-            <w:tcW w:w="600" w:type="dxa"/>
+        <w:tc>
+          <w:tcPr>
+            <w:tcW w:w="1600" w:type="dxa"/>
+          </w:tcPr>
+          <w:p>
+            <w:pPr>
+              <w:spacing w:after="20" w:line="240" w:lineRule="auto"/>
+              <w:jc w:val="left"/>
+            </w:pPr>
+            <w:r>
+              <w:t xml:space="preserve">Pendiente — adjuntar captura del tablero y/o registro de ejecución de n8n para E2.</w:t>
+            </w:r>
+          </w:p>
+        </w:tc>
+      </w:tr>
+      <w:tr>
+        <w:tc>
+          <w:tcPr>
+            <w:tcW w:w="500" w:type="dxa"/>
           </w:tcPr>
           <w:p>
             <w:pPr>
@@ -5225,7 +5681,7 @@
         </w:tc>
         <w:tc>
           <w:tcPr>
-            <w:tcW w:w="4200" w:type="dxa"/>
+            <w:tcW w:w="2500" w:type="dxa"/>
           </w:tcPr>
           <w:p>
             <w:pPr>
@@ -5239,7 +5695,21 @@
         </w:tc>
         <w:tc>
           <w:tcPr>
-            <w:tcW w:w="4200" w:type="dxa"/>
+            <w:tcW w:w="2200" w:type="dxa"/>
+          </w:tcPr>
+          <w:p>
+            <w:pPr>
+              <w:spacing w:after="20" w:line="240" w:lineRule="auto"/>
+              <w:jc w:val="left"/>
+            </w:pPr>
+            <w:r>
+              <w:t xml:space="preserve">Presupuesto y urgencia bajos deben clasificar el lead como COLD, sin generación de propuesta, notificando solo por Telegram.</w:t>
+            </w:r>
+          </w:p>
+        </w:tc>
+        <w:tc>
+          <w:tcPr>
+            <w:tcW w:w="2200" w:type="dxa"/>
           </w:tcPr>
           <w:p>
             <w:pPr>
@@ -5251,11 +5721,25 @@
             </w:r>
           </w:p>
         </w:tc>
-      </w:tr>
-      <w:tr>
-        <w:tc>
-          <w:tcPr>
-            <w:tcW w:w="600" w:type="dxa"/>
+        <w:tc>
+          <w:tcPr>
+            <w:tcW w:w="1600" w:type="dxa"/>
+          </w:tcPr>
+          <w:p>
+            <w:pPr>
+              <w:spacing w:after="20" w:line="240" w:lineRule="auto"/>
+              <w:jc w:val="left"/>
+            </w:pPr>
+            <w:r>
+              <w:t xml:space="preserve">Pendiente — adjuntar captura de Telegram y/o registro de ejecución de n8n para E3.</w:t>
+            </w:r>
+          </w:p>
+        </w:tc>
+      </w:tr>
+      <w:tr>
+        <w:tc>
+          <w:tcPr>
+            <w:tcW w:w="500" w:type="dxa"/>
           </w:tcPr>
           <w:p>
             <w:pPr>
@@ -5269,7 +5753,7 @@
         </w:tc>
         <w:tc>
           <w:tcPr>
-            <w:tcW w:w="4200" w:type="dxa"/>
+            <w:tcW w:w="2500" w:type="dxa"/>
           </w:tcPr>
           <w:p>
             <w:pPr>
@@ -5283,7 +5767,21 @@
         </w:tc>
         <w:tc>
           <w:tcPr>
-            <w:tcW w:w="4200" w:type="dxa"/>
+            <w:tcW w:w="2200" w:type="dxa"/>
+          </w:tcPr>
+          <w:p>
+            <w:pPr>
+              <w:spacing w:after="20" w:line="240" w:lineRule="auto"/>
+              <w:jc w:val="left"/>
+            </w:pPr>
+            <w:r>
+              <w:t xml:space="preserve">La validación de entrada debe rechazar datos inconsistentes (nombre, correo, presupuesto) y detener el flujo sin insertar el registro.</w:t>
+            </w:r>
+          </w:p>
+        </w:tc>
+        <w:tc>
+          <w:tcPr>
+            <w:tcW w:w="2200" w:type="dxa"/>
           </w:tcPr>
           <w:p>
             <w:pPr>
@@ -5295,11 +5793,25 @@
             </w:r>
           </w:p>
         </w:tc>
-      </w:tr>
-      <w:tr>
-        <w:tc>
-          <w:tcPr>
-            <w:tcW w:w="600" w:type="dxa"/>
+        <w:tc>
+          <w:tcPr>
+            <w:tcW w:w="1600" w:type="dxa"/>
+          </w:tcPr>
+          <w:p>
+            <w:pPr>
+              <w:spacing w:after="20" w:line="240" w:lineRule="auto"/>
+              <w:jc w:val="left"/>
+            </w:pPr>
+            <w:r>
+              <w:t xml:space="preserve">Pendiente — adjuntar captura del registro de ejecución de n8n (rama de error) para E4.</w:t>
+            </w:r>
+          </w:p>
+        </w:tc>
+      </w:tr>
+      <w:tr>
+        <w:tc>
+          <w:tcPr>
+            <w:tcW w:w="500" w:type="dxa"/>
           </w:tcPr>
           <w:p>
             <w:pPr>
@@ -5313,7 +5825,7 @@
         </w:tc>
         <w:tc>
           <w:tcPr>
-            <w:tcW w:w="4200" w:type="dxa"/>
+            <w:tcW w:w="2500" w:type="dxa"/>
           </w:tcPr>
           <w:p>
             <w:pPr>
@@ -5327,7 +5839,21 @@
         </w:tc>
         <w:tc>
           <w:tcPr>
-            <w:tcW w:w="4200" w:type="dxa"/>
+            <w:tcW w:w="2200" w:type="dxa"/>
+          </w:tcPr>
+          <w:p>
+            <w:pPr>
+              <w:spacing w:after="20" w:line="240" w:lineRule="auto"/>
+              <w:jc w:val="left"/>
+            </w:pPr>
+            <w:r>
+              <w:t xml:space="preserve">Un token válido debe marcar el lead como ACEPTADO, generar la factura en PDF, enviarla por correo y actualizar el estado a FACTURADO con notificación.</w:t>
+            </w:r>
+          </w:p>
+        </w:tc>
+        <w:tc>
+          <w:tcPr>
+            <w:tcW w:w="2200" w:type="dxa"/>
           </w:tcPr>
           <w:p>
             <w:pPr>
@@ -5339,11 +5865,25 @@
             </w:r>
           </w:p>
         </w:tc>
-      </w:tr>
-      <w:tr>
-        <w:tc>
-          <w:tcPr>
-            <w:tcW w:w="600" w:type="dxa"/>
+        <w:tc>
+          <w:tcPr>
+            <w:tcW w:w="1600" w:type="dxa"/>
+          </w:tcPr>
+          <w:p>
+            <w:pPr>
+              <w:spacing w:after="20" w:line="240" w:lineRule="auto"/>
+              <w:jc w:val="left"/>
+            </w:pPr>
+            <w:r>
+              <w:t xml:space="preserve">Pendiente — adjuntar la factura PDF generada y/o el correo enviado para E5.</w:t>
+            </w:r>
+          </w:p>
+        </w:tc>
+      </w:tr>
+      <w:tr>
+        <w:tc>
+          <w:tcPr>
+            <w:tcW w:w="500" w:type="dxa"/>
           </w:tcPr>
           <w:p>
             <w:pPr>
@@ -5357,7 +5897,7 @@
         </w:tc>
         <w:tc>
           <w:tcPr>
-            <w:tcW w:w="4200" w:type="dxa"/>
+            <w:tcW w:w="2500" w:type="dxa"/>
           </w:tcPr>
           <w:p>
             <w:pPr>
@@ -5371,7 +5911,21 @@
         </w:tc>
         <w:tc>
           <w:tcPr>
-            <w:tcW w:w="4200" w:type="dxa"/>
+            <w:tcW w:w="2200" w:type="dxa"/>
+          </w:tcPr>
+          <w:p>
+            <w:pPr>
+              <w:spacing w:after="20" w:line="240" w:lineRule="auto"/>
+              <w:jc w:val="left"/>
+            </w:pPr>
+            <w:r>
+              <w:t xml:space="preserve">Un token ya utilizado debe ser rechazado, informando que el enlace ya fue procesado, sin duplicar la factura.</w:t>
+            </w:r>
+          </w:p>
+        </w:tc>
+        <w:tc>
+          <w:tcPr>
+            <w:tcW w:w="2200" w:type="dxa"/>
           </w:tcPr>
           <w:p>
             <w:pPr>
@@ -5383,11 +5937,25 @@
             </w:r>
           </w:p>
         </w:tc>
-      </w:tr>
-      <w:tr>
-        <w:tc>
-          <w:tcPr>
-            <w:tcW w:w="600" w:type="dxa"/>
+        <w:tc>
+          <w:tcPr>
+            <w:tcW w:w="1600" w:type="dxa"/>
+          </w:tcPr>
+          <w:p>
+            <w:pPr>
+              <w:spacing w:after="20" w:line="240" w:lineRule="auto"/>
+              <w:jc w:val="left"/>
+            </w:pPr>
+            <w:r>
+              <w:t xml:space="preserve">Pendiente — adjuntar captura de la respuesta "ya_procesado" para E6.</w:t>
+            </w:r>
+          </w:p>
+        </w:tc>
+      </w:tr>
+      <w:tr>
+        <w:tc>
+          <w:tcPr>
+            <w:tcW w:w="500" w:type="dxa"/>
           </w:tcPr>
           <w:p>
             <w:pPr>
@@ -5401,7 +5969,7 @@
         </w:tc>
         <w:tc>
           <w:tcPr>
-            <w:tcW w:w="4200" w:type="dxa"/>
+            <w:tcW w:w="2500" w:type="dxa"/>
           </w:tcPr>
           <w:p>
             <w:pPr>
@@ -5415,7 +5983,21 @@
         </w:tc>
         <w:tc>
           <w:tcPr>
-            <w:tcW w:w="4200" w:type="dxa"/>
+            <w:tcW w:w="2200" w:type="dxa"/>
+          </w:tcPr>
+          <w:p>
+            <w:pPr>
+              <w:spacing w:after="20" w:line="240" w:lineRule="auto"/>
+              <w:jc w:val="left"/>
+            </w:pPr>
+            <w:r>
+              <w:t xml:space="preserve">La suscripción en tiempo real (postgres_changes) debe reflejar el nuevo lead en el tablero sin necesidad de recargar la página.</w:t>
+            </w:r>
+          </w:p>
+        </w:tc>
+        <w:tc>
+          <w:tcPr>
+            <w:tcW w:w="2200" w:type="dxa"/>
           </w:tcPr>
           <w:p>
             <w:pPr>
@@ -5424,6 +6006,20 @@
             </w:pPr>
             <w:r>
               <w:t xml:space="preserve">El tablero refleja el nuevo lead en tiempo real, sin recarga manual.</w:t>
+            </w:r>
+          </w:p>
+        </w:tc>
+        <w:tc>
+          <w:tcPr>
+            <w:tcW w:w="1600" w:type="dxa"/>
+          </w:tcPr>
+          <w:p>
+            <w:pPr>
+              <w:spacing w:after="20" w:line="240" w:lineRule="auto"/>
+              <w:jc w:val="left"/>
+            </w:pPr>
+            <w:r>
+              <w:t xml:space="preserve">Pendiente — adjuntar captura del tablero antes/después y/o video corto para E7.</w:t>
             </w:r>
           </w:p>
         </w:tc>
@@ -5839,6 +6435,20 @@
     </w:p>
     <w:p>
       <w:r>
+        <w:t xml:space="preserve">HubSpot. (2024). </w:t>
+      </w:r>
+      <w:r>
+        <w:rPr>
+          <w:i/>
+        </w:rPr>
+        <w:t xml:space="preserve">HubSpot pricing</w:t>
+      </w:r>
+      <w:r>
+        <w:t xml:space="preserve">. https://www.hubspot.com/pricing</w:t>
+      </w:r>
+    </w:p>
+    <w:p>
+      <w:r>
         <w:t xml:space="preserve">ISO/IEC. (2011). </w:t>
       </w:r>
       <w:r>
@@ -5881,6 +6491,20 @@
     </w:p>
     <w:p>
       <w:r>
+        <w:t xml:space="preserve">Make. (2024). </w:t>
+      </w:r>
+      <w:r>
+        <w:rPr>
+          <w:i/>
+        </w:rPr>
+        <w:t xml:space="preserve">Make help center</w:t>
+      </w:r>
+      <w:r>
+        <w:t xml:space="preserve">. https://www.make.com/en/help</w:t>
+      </w:r>
+    </w:p>
+    <w:p>
+      <w:r>
         <w:t xml:space="preserve">n8n.io. (2024). </w:t>
       </w:r>
       <w:r>
@@ -5909,6 +6533,20 @@
     </w:p>
     <w:p>
       <w:r>
+        <w:t xml:space="preserve">Pipedrive. (2024). </w:t>
+      </w:r>
+      <w:r>
+        <w:rPr>
+          <w:i/>
+        </w:rPr>
+        <w:t xml:space="preserve">Pipedrive pricing</w:t>
+      </w:r>
+      <w:r>
+        <w:t xml:space="preserve">. https://www.pipedrive.com/en/pricing</w:t>
+      </w:r>
+    </w:p>
+    <w:p>
+      <w:r>
         <w:t xml:space="preserve">PostgreSQL Global Development Group. (2024). </w:t>
       </w:r>
       <w:r>
@@ -5989,6 +6627,20 @@
       </w:r>
       <w:r>
         <w:t xml:space="preserve">. https://nextjs.org/docs</w:t>
+      </w:r>
+    </w:p>
+    <w:p>
+      <w:r>
+        <w:t xml:space="preserve">Zapier. (2024). </w:t>
+      </w:r>
+      <w:r>
+        <w:rPr>
+          <w:i/>
+        </w:rPr>
+        <w:t xml:space="preserve">Zapier pricing</w:t>
+      </w:r>
+      <w:r>
+        <w:t xml:space="preserve">. https://zapier.com/pricing</w:t>
       </w:r>
     </w:p>
     <w:p>

</xml_diff>